<commit_message>
[GH34] feat(export): GH34 — sommaire dans les gabarits Word d'exemple
Page « Sommaire » après la page de garde des 5 gabarits Word d'exemple : table
des matières Word (titres 1 à 3 + titres d'éléments au niveau hiérarchique 4,
liens, numéros de page) mise à jour par Word à l'ouverture. Gabarit client
contenant une table des matières : mise à jour des champs demandée (ordre du
schéma de settings.xml respecté) et fin du champ TOC préservée quand elle
partage un paragraphe avec une balise de section (isolateFieldChars).
Vérifié : 118 contrôles, Word 16 (tables mises à jour avec les données).

Refs #34

Co-Authored-By: Claude Opus 5.5 <noreply@anthropic.com>
</commit_message>
<xml_diff>
--- a/apps/desktop/resources/export-templates/Cahier de campagne.docx
+++ b/apps/desktop/resources/export-templates/Cahier de campagne.docx
@@ -367,6 +367,42 @@
         <w:t xml:space="preserve">Document généré par Polenta à partir du gabarit {{export.templateName}}.</w:t>
       </w:r>
     </w:p>
+    <w:p>
+      <w:r>
+        <w:br w:type="page"/>
+      </w:r>
+    </w:p>
+    <w:p>
+      <w:pPr>
+        <w:pStyle w:val="Title"/>
+      </w:pPr>
+      <w:r>
+        <w:rPr>
+          <w:sz w:val="40"/>
+          <w:szCs w:val="40"/>
+        </w:rPr>
+        <w:t xml:space="preserve">Sommaire</w:t>
+      </w:r>
+    </w:p>
+    <w:sdt>
+      <w:sdtPr>
+        <w:alias w:val="Sommaire"/>
+      </w:sdtPr>
+      <w:sdtContent>
+        <w:p>
+          <w:r>
+            <w:fldChar w:fldCharType="begin" w:dirty="true"/>
+            <w:instrText xml:space="preserve">TOC \h \o "1-4" \u</w:instrText>
+            <w:fldChar w:fldCharType="separate"/>
+          </w:r>
+        </w:p>
+        <w:p>
+          <w:r>
+            <w:fldChar w:fldCharType="end"/>
+          </w:r>
+        </w:p>
+      </w:sdtContent>
+    </w:sdt>
     <w:p>
       <w:r>
         <w:br w:type="page"/>
@@ -1181,7 +1217,7 @@
     </w:rPr>
   </w:style>
   <w:style w:type="paragraph" w:styleId="PolentaItemTitle">
-    <w:name w:val="Polenta — titre d’élément"/>
+    <w:name w:val="Polenta — Titre d’élément"/>
     <w:basedOn w:val="Normal"/>
     <w:next w:val="Normal"/>
     <w:pPr>
@@ -1190,6 +1226,7 @@
         <w:bottom w:val="single" w:color="D9E2F3" w:sz="4" w:space="2"/>
       </w:pBdr>
       <w:spacing w:after="40" w:before="240"/>
+      <w:outlineLvl w:val="3"/>
     </w:pPr>
     <w:rPr>
       <w:b/>

</xml_diff>

<commit_message>
[GH243] feat(changesets): GH243 sprint1 — retrait du changeset, réouverture uniforme par le statut
- Objet changeset retiré (types, services, IPC, MCP, vue, graphe, préférence changeTracking) ;
  fichiers changesets/ ignorés, leurs IDs réservés ; type changeset et changeTracking ignorés à la
  lecture du schéma.
- Règle de version unique (versionBump) ; vue Word : statut éditable sur un élément verrouillé,
  bouton « Rouvrir en brouillon » retiré.
- Campagne sans baselineRef ni changeset (paramètres à l'état courant).
- Modifications locales et « Impact à vérifier » dans le panneau Version, Constellation dans le
  panneau Exigences.
- Tests unitaires et e2e GH243, e2e adaptés, SPEC mises à jour.

Refs #243

Co-Authored-By: Claude Opus 5.5 <noreply@anthropic.com>
</commit_message>
<xml_diff>
--- a/apps/desktop/resources/export-templates/Cahier de campagne.docx
+++ b/apps/desktop/resources/export-templates/Cahier de campagne.docx
@@ -151,39 +151,6 @@
                 <w:szCs w:val="18"/>
               </w:rPr>
               <w:t xml:space="preserve">{{campaign.component}}</w:t>
-            </w:r>
-          </w:p>
-        </w:tc>
-      </w:tr>
-      <w:tr>
-        <w:tc>
-          <w:tcPr>
-            <w:tcW w:type="pct" w:w="30%"/>
-            <w:shd w:fill="D9E2F3" w:color="auto" w:val="clear"/>
-          </w:tcPr>
-          <w:p>
-            <w:r>
-              <w:rPr>
-                <w:b/>
-                <w:bCs/>
-                <w:sz w:val="18"/>
-                <w:szCs w:val="18"/>
-              </w:rPr>
-              <w:t xml:space="preserve">Référence</w:t>
-            </w:r>
-          </w:p>
-        </w:tc>
-        <w:tc>
-          <w:tcPr>
-            <w:tcW w:type="pct" w:w="70%"/>
-          </w:tcPr>
-          <w:p>
-            <w:r>
-              <w:rPr>
-                <w:sz w:val="18"/>
-                <w:szCs w:val="18"/>
-              </w:rPr>
-              <w:t xml:space="preserve">{{campaign.baselineRef}}</w:t>
             </w:r>
           </w:p>
         </w:tc>

</xml_diff>